<commit_message>
Update WorkLog week 5
</commit_message>
<xml_diff>
--- a/Work/2022182017_BGC/WorkLog/백경철_작업일지_5주차.docx
+++ b/Work/2022182017_BGC/WorkLog/백경철_작업일지_5주차.docx
@@ -445,21 +445,7 @@
         <w:rPr>
           <w:rFonts w:hint="eastAsia"/>
         </w:rPr>
-        <w:t xml:space="preserve"> </w:t>
-      </w:r>
-      <w:proofErr w:type="spellStart"/>
-      <w:r>
-        <w:rPr>
-          <w:rFonts w:hint="eastAsia"/>
-        </w:rPr>
-        <w:t>브랜치</w:t>
-      </w:r>
-      <w:proofErr w:type="spellEnd"/>
-      <w:r>
-        <w:rPr>
-          <w:rFonts w:hint="eastAsia"/>
-        </w:rPr>
-        <w:t xml:space="preserve"> 우선순위를 사용하여 기존 행동을 중단한 후 새로운 영역의 행동을 실행한다</w:t>
+        <w:t xml:space="preserve"> 브랜치 우선순위를 사용하여 기존 행동을 중단한 후 새로운 영역의 행동을 실행한다</w:t>
       </w:r>
       <w:r>
         <w:t>.</w:t>
@@ -612,9 +598,483 @@
         <w:tabs>
           <w:tab w:val="left" w:pos="2765"/>
         </w:tabs>
-        <w:rPr>
-          <w:rFonts w:hint="eastAsia"/>
-        </w:rPr>
+      </w:pPr>
+    </w:p>
+    <w:p>
+      <w:pPr>
+        <w:tabs>
+          <w:tab w:val="left" w:pos="2765"/>
+        </w:tabs>
+      </w:pPr>
+    </w:p>
+    <w:p>
+      <w:pPr>
+        <w:tabs>
+          <w:tab w:val="left" w:pos="2765"/>
+        </w:tabs>
+      </w:pPr>
+    </w:p>
+    <w:p>
+      <w:pPr>
+        <w:tabs>
+          <w:tab w:val="left" w:pos="2765"/>
+        </w:tabs>
+      </w:pPr>
+    </w:p>
+    <w:p>
+      <w:pPr>
+        <w:tabs>
+          <w:tab w:val="left" w:pos="2765"/>
+        </w:tabs>
+      </w:pPr>
+    </w:p>
+    <w:p>
+      <w:pPr>
+        <w:tabs>
+          <w:tab w:val="left" w:pos="2765"/>
+        </w:tabs>
+      </w:pPr>
+    </w:p>
+    <w:p>
+      <w:pPr>
+        <w:tabs>
+          <w:tab w:val="left" w:pos="2765"/>
+        </w:tabs>
+      </w:pPr>
+    </w:p>
+    <w:p>
+      <w:pPr>
+        <w:tabs>
+          <w:tab w:val="left" w:pos="2765"/>
+        </w:tabs>
+      </w:pPr>
+    </w:p>
+    <w:p>
+      <w:pPr>
+        <w:tabs>
+          <w:tab w:val="left" w:pos="2765"/>
+        </w:tabs>
+      </w:pPr>
+      <w:r>
+        <w:rPr>
+          <w:rFonts w:hint="eastAsia"/>
+        </w:rPr>
+        <w:lastRenderedPageBreak/>
+        <w:t>2</w:t>
+      </w:r>
+      <w:r>
+        <w:t xml:space="preserve">. </w:t>
+      </w:r>
+      <w:r>
+        <w:rPr>
+          <w:rFonts w:hint="eastAsia"/>
+        </w:rPr>
+        <w:t xml:space="preserve">플레이어와 마네킹 </w:t>
+      </w:r>
+      <w:r>
+        <w:t xml:space="preserve">AI </w:t>
+      </w:r>
+      <w:r>
+        <w:rPr>
+          <w:rFonts w:hint="eastAsia"/>
+        </w:rPr>
+        <w:t>와의 상호작용에 따른 심박수 시스템 설계</w:t>
+      </w:r>
+    </w:p>
+    <w:p>
+      <w:pPr>
+        <w:tabs>
+          <w:tab w:val="left" w:pos="2765"/>
+        </w:tabs>
+      </w:pPr>
+      <w:r>
+        <w:rPr>
+          <w:rFonts w:hint="eastAsia"/>
+        </w:rPr>
+        <w:t xml:space="preserve"> </w:t>
+      </w:r>
+      <w:r>
+        <w:t xml:space="preserve">1) </w:t>
+      </w:r>
+      <w:r>
+        <w:rPr>
+          <w:rFonts w:hint="eastAsia"/>
+        </w:rPr>
+        <w:t>플레이어의 시야 영역과</w:t>
+      </w:r>
+      <w:r>
+        <w:t xml:space="preserve"> </w:t>
+      </w:r>
+      <w:r>
+        <w:rPr>
+          <w:rFonts w:hint="eastAsia"/>
+        </w:rPr>
+        <w:t xml:space="preserve">마네킹 </w:t>
+      </w:r>
+      <w:proofErr w:type="gramStart"/>
+      <w:r>
+        <w:t xml:space="preserve">AI </w:t>
+      </w:r>
+      <w:r>
+        <w:rPr>
+          <w:rFonts w:hint="eastAsia"/>
+        </w:rPr>
+        <w:t>의</w:t>
+      </w:r>
+      <w:proofErr w:type="gramEnd"/>
+      <w:r>
+        <w:rPr>
+          <w:rFonts w:hint="eastAsia"/>
+        </w:rPr>
+        <w:t xml:space="preserve"> 조우 영역을</w:t>
+      </w:r>
+      <w:r>
+        <w:t xml:space="preserve"> </w:t>
+      </w:r>
+      <w:r>
+        <w:rPr>
+          <w:rFonts w:hint="eastAsia"/>
+        </w:rPr>
+        <w:t xml:space="preserve">설정하고 이를 </w:t>
+      </w:r>
+      <w:r>
+        <w:rPr>
+          <w:rFonts w:hint="eastAsia"/>
+        </w:rPr>
+        <w:t xml:space="preserve">노란색 </w:t>
+      </w:r>
+      <w:r>
+        <w:rPr>
+          <w:rFonts w:hint="eastAsia"/>
+        </w:rPr>
+        <w:t>디버깅 원으로 표현하였다</w:t>
+      </w:r>
+      <w:r>
+        <w:t>.</w:t>
+      </w:r>
+    </w:p>
+    <w:p>
+      <w:pPr>
+        <w:tabs>
+          <w:tab w:val="left" w:pos="2765"/>
+        </w:tabs>
+      </w:pPr>
+      <w:r>
+        <w:rPr>
+          <w:noProof/>
+        </w:rPr>
+        <w:drawing>
+          <wp:inline distT="0" distB="0" distL="0" distR="0" wp14:anchorId="01D0F006" wp14:editId="4794D44C">
+            <wp:extent cx="5721350" cy="2774950"/>
+            <wp:effectExtent l="0" t="0" r="0" b="6350"/>
+            <wp:docPr id="2" name="그림 2"/>
+            <wp:cNvGraphicFramePr>
+              <a:graphicFrameLocks xmlns:a="http://schemas.openxmlformats.org/drawingml/2006/main" noChangeAspect="1"/>
+            </wp:cNvGraphicFramePr>
+            <a:graphic xmlns:a="http://schemas.openxmlformats.org/drawingml/2006/main">
+              <a:graphicData uri="http://schemas.openxmlformats.org/drawingml/2006/picture">
+                <pic:pic xmlns:pic="http://schemas.openxmlformats.org/drawingml/2006/picture">
+                  <pic:nvPicPr>
+                    <pic:cNvPr id="0" name="Picture 1"/>
+                    <pic:cNvPicPr>
+                      <a:picLocks noChangeAspect="1" noChangeArrowheads="1"/>
+                    </pic:cNvPicPr>
+                  </pic:nvPicPr>
+                  <pic:blipFill>
+                    <a:blip r:embed="rId7" cstate="print">
+                      <a:extLst>
+                        <a:ext uri="{28A0092B-C50C-407E-A947-70E740481C1C}">
+                          <a14:useLocalDpi xmlns:a14="http://schemas.microsoft.com/office/drawing/2010/main" val="0"/>
+                        </a:ext>
+                      </a:extLst>
+                    </a:blip>
+                    <a:srcRect/>
+                    <a:stretch>
+                      <a:fillRect/>
+                    </a:stretch>
+                  </pic:blipFill>
+                  <pic:spPr bwMode="auto">
+                    <a:xfrm>
+                      <a:off x="0" y="0"/>
+                      <a:ext cx="5721350" cy="2774950"/>
+                    </a:xfrm>
+                    <a:prstGeom prst="rect">
+                      <a:avLst/>
+                    </a:prstGeom>
+                    <a:noFill/>
+                    <a:ln>
+                      <a:noFill/>
+                    </a:ln>
+                  </pic:spPr>
+                </pic:pic>
+              </a:graphicData>
+            </a:graphic>
+          </wp:inline>
+        </w:drawing>
+      </w:r>
+    </w:p>
+    <w:p>
+      <w:pPr>
+        <w:tabs>
+          <w:tab w:val="left" w:pos="2765"/>
+        </w:tabs>
+      </w:pPr>
+      <w:r>
+        <w:rPr>
+          <w:rFonts w:hint="eastAsia"/>
+        </w:rPr>
+        <w:t xml:space="preserve"> </w:t>
+      </w:r>
+      <w:r>
+        <w:t>2)</w:t>
+      </w:r>
+      <w:r>
+        <w:t xml:space="preserve"> </w:t>
+      </w:r>
+      <w:r>
+        <w:rPr>
+          <w:rFonts w:hint="eastAsia"/>
+        </w:rPr>
+        <w:t>시야 영역에 따른 기본 심박수를 설정하였다</w:t>
+      </w:r>
+      <w:r>
+        <w:t>.</w:t>
+      </w:r>
+      <w:r>
+        <w:t xml:space="preserve"> </w:t>
+      </w:r>
+      <w:r>
+        <w:rPr>
+          <w:rFonts w:hint="eastAsia"/>
+        </w:rPr>
+        <w:t xml:space="preserve">마네킹 </w:t>
+      </w:r>
+      <w:r>
+        <w:t xml:space="preserve">AI </w:t>
+      </w:r>
+      <w:r>
+        <w:rPr>
+          <w:rFonts w:hint="eastAsia"/>
+        </w:rPr>
+        <w:t xml:space="preserve">가 </w:t>
+      </w:r>
+      <w:r>
+        <w:rPr>
+          <w:rFonts w:hint="eastAsia"/>
+        </w:rPr>
+        <w:t>시야 영역에 들어오고 마네킹과 플레이어 사이에 충돌체 없이 L</w:t>
+      </w:r>
+      <w:r>
+        <w:t xml:space="preserve">ineTrace </w:t>
+      </w:r>
+      <w:r>
+        <w:rPr>
+          <w:rFonts w:hint="eastAsia"/>
+        </w:rPr>
+        <w:t>로 만난다면</w:t>
+      </w:r>
+      <w:r>
+        <w:t xml:space="preserve">, </w:t>
+      </w:r>
+      <w:r>
+        <w:rPr>
+          <w:rFonts w:hint="eastAsia"/>
+        </w:rPr>
+        <w:t>해당 거리에 따른 심박수가 플레이어에게 설정된다</w:t>
+      </w:r>
+      <w:r>
+        <w:t>.</w:t>
+      </w:r>
+      <w:r>
+        <w:t xml:space="preserve"> </w:t>
+      </w:r>
+      <w:r>
+        <w:rPr>
+          <w:rFonts w:hint="eastAsia"/>
+        </w:rPr>
+        <w:t>심박수는 플레이어에게 가장 가까운 마네킹을 기준으로 기본 심박수가 설정된다</w:t>
+      </w:r>
+    </w:p>
+    <w:p>
+      <w:pPr>
+        <w:tabs>
+          <w:tab w:val="left" w:pos="2765"/>
+        </w:tabs>
+      </w:pPr>
+      <w:r>
+        <w:rPr>
+          <w:rFonts w:hint="eastAsia"/>
+        </w:rPr>
+        <w:t xml:space="preserve"> </w:t>
+      </w:r>
+      <w:r>
+        <w:t xml:space="preserve">3) </w:t>
+      </w:r>
+      <w:r>
+        <w:rPr>
+          <w:rFonts w:hint="eastAsia"/>
+        </w:rPr>
+        <w:t>시야 영역과 동일한 방향을 향하는 조우 영역을 설정하였다</w:t>
+      </w:r>
+      <w:r>
+        <w:t xml:space="preserve">. </w:t>
+      </w:r>
+      <w:r>
+        <w:rPr>
+          <w:rFonts w:hint="eastAsia"/>
+        </w:rPr>
+        <w:t xml:space="preserve">마네킹 </w:t>
+      </w:r>
+      <w:r>
+        <w:t xml:space="preserve">AI </w:t>
+      </w:r>
+      <w:r>
+        <w:rPr>
+          <w:rFonts w:hint="eastAsia"/>
+        </w:rPr>
+        <w:t xml:space="preserve">가 </w:t>
+      </w:r>
+      <w:r>
+        <w:rPr>
+          <w:rFonts w:hint="eastAsia"/>
+        </w:rPr>
+        <w:t>영역에 들어오고</w:t>
+      </w:r>
+      <w:r>
+        <w:t xml:space="preserve"> </w:t>
+      </w:r>
+      <w:r>
+        <w:rPr>
+          <w:rFonts w:hint="eastAsia"/>
+        </w:rPr>
+        <w:t xml:space="preserve">마찬가지로 </w:t>
+      </w:r>
+      <w:r>
+        <w:t xml:space="preserve">LineTrace </w:t>
+      </w:r>
+      <w:r>
+        <w:rPr>
+          <w:rFonts w:hint="eastAsia"/>
+        </w:rPr>
+        <w:t>로 만난다면</w:t>
+      </w:r>
+      <w:r>
+        <w:t xml:space="preserve"> </w:t>
+      </w:r>
+      <w:r>
+        <w:rPr>
+          <w:rFonts w:hint="eastAsia"/>
+        </w:rPr>
+        <w:t>급격히 조우 심박수가 증가하다가 시간이 지나면서 천천히 감소한다</w:t>
+      </w:r>
+      <w:r>
+        <w:t>.</w:t>
+      </w:r>
+      <w:r>
+        <w:t xml:space="preserve"> </w:t>
+      </w:r>
+      <w:r>
+        <w:rPr>
+          <w:rFonts w:hint="eastAsia"/>
+        </w:rPr>
+        <w:t xml:space="preserve">조우 </w:t>
+      </w:r>
+      <w:r>
+        <w:rPr>
+          <w:rFonts w:hint="eastAsia"/>
+        </w:rPr>
+        <w:t>심박수가 감소하다가 새로운 조우 심박수가 생기면서 기존의 조우 심박수보다 크다면 해당 조우 심박수로 변경된다</w:t>
+      </w:r>
+      <w:r>
+        <w:t>.</w:t>
+      </w:r>
+      <w:r>
+        <w:t xml:space="preserve"> </w:t>
+      </w:r>
+      <w:r>
+        <w:rPr>
+          <w:rFonts w:hint="eastAsia"/>
+        </w:rPr>
+        <w:t>추가로 조우 심박수에 해당하는 마네킹은 3 초 이상 감지(</w:t>
+      </w:r>
+      <w:r>
+        <w:rPr>
+          <w:rFonts w:hint="eastAsia"/>
+        </w:rPr>
+        <w:t>플레이어의 시야 영역에 들어</w:t>
+      </w:r>
+      <w:r>
+        <w:rPr>
+          <w:rFonts w:hint="eastAsia"/>
+        </w:rPr>
+        <w:t>오고</w:t>
+      </w:r>
+      <w:r>
+        <w:t xml:space="preserve">, </w:t>
+      </w:r>
+      <w:proofErr w:type="gramStart"/>
+      <w:r>
+        <w:t xml:space="preserve">LineTrace </w:t>
+      </w:r>
+      <w:r>
+        <w:rPr>
+          <w:rFonts w:hint="eastAsia"/>
+        </w:rPr>
+        <w:t>의</w:t>
+      </w:r>
+      <w:proofErr w:type="gramEnd"/>
+      <w:r>
+        <w:rPr>
+          <w:rFonts w:hint="eastAsia"/>
+        </w:rPr>
+        <w:t xml:space="preserve"> 사이에 충돌체가 없다면</w:t>
+      </w:r>
+      <w:r>
+        <w:t>)</w:t>
+      </w:r>
+      <w:r>
+        <w:rPr>
+          <w:rFonts w:hint="eastAsia"/>
+        </w:rPr>
+        <w:t>되지 않으면 조우 심박수가 다시 증가하지 않도록 설정하였다</w:t>
+      </w:r>
+      <w:r>
+        <w:t>.</w:t>
+      </w:r>
+    </w:p>
+    <w:p>
+      <w:pPr>
+        <w:tabs>
+          <w:tab w:val="left" w:pos="2765"/>
+        </w:tabs>
+      </w:pPr>
+    </w:p>
+    <w:p>
+      <w:pPr>
+        <w:tabs>
+          <w:tab w:val="left" w:pos="2765"/>
+        </w:tabs>
+      </w:pPr>
+    </w:p>
+    <w:p>
+      <w:pPr>
+        <w:tabs>
+          <w:tab w:val="left" w:pos="2765"/>
+        </w:tabs>
+      </w:pPr>
+    </w:p>
+    <w:p>
+      <w:pPr>
+        <w:tabs>
+          <w:tab w:val="left" w:pos="2765"/>
+        </w:tabs>
+      </w:pPr>
+    </w:p>
+    <w:p>
+      <w:pPr>
+        <w:tabs>
+          <w:tab w:val="left" w:pos="2765"/>
+        </w:tabs>
       </w:pPr>
     </w:p>
     <w:tbl>
@@ -647,6 +1107,7 @@
                 <w:b/>
                 <w:bCs/>
               </w:rPr>
+              <w:lastRenderedPageBreak/>
               <w:t>문제점 정리</w:t>
             </w:r>
           </w:p>
@@ -829,18 +1290,8 @@
                 <w:b/>
                 <w:bCs/>
               </w:rPr>
-              <w:t xml:space="preserve">다음주 </w:t>
-            </w:r>
-            <w:proofErr w:type="spellStart"/>
-            <w:r>
-              <w:rPr>
-                <w:rFonts w:hint="eastAsia"/>
-                <w:b/>
-                <w:bCs/>
-              </w:rPr>
-              <w:t>할일</w:t>
-            </w:r>
-            <w:proofErr w:type="spellEnd"/>
+              <w:t>다음주 할일</w:t>
+            </w:r>
           </w:p>
         </w:tc>
         <w:tc>
@@ -853,18 +1304,43 @@
               <w:tabs>
                 <w:tab w:val="left" w:pos="2765"/>
               </w:tabs>
+              <w:rPr>
+                <w:rFonts w:hint="eastAsia"/>
+              </w:rPr>
             </w:pPr>
             <w:r>
               <w:rPr>
                 <w:rFonts w:hint="eastAsia"/>
               </w:rPr>
-              <w:t xml:space="preserve">1. </w:t>
+              <w:t>1</w:t>
+            </w:r>
+            <w:r>
+              <w:t xml:space="preserve">. </w:t>
             </w:r>
             <w:r>
               <w:rPr>
                 <w:rFonts w:hint="eastAsia"/>
               </w:rPr>
               <w:t>팀원과 회의 진행</w:t>
+            </w:r>
+            <w:r>
+              <w:br/>
+              <w:t xml:space="preserve">2. </w:t>
+            </w:r>
+            <w:r>
+              <w:rPr>
+                <w:rFonts w:hint="eastAsia"/>
+              </w:rPr>
+              <w:t xml:space="preserve">플레이어와 상호작용하는 오브젝트 </w:t>
+            </w:r>
+            <w:r>
+              <w:t xml:space="preserve">UI </w:t>
+            </w:r>
+            <w:r>
+              <w:rPr>
+                <w:rFonts w:hint="eastAsia"/>
+              </w:rPr>
+              <w:t>시스템 제작</w:t>
             </w:r>
           </w:p>
         </w:tc>
@@ -928,7 +1404,7 @@
     </w:tbl>
     <w:p/>
     <w:sectPr>
-      <w:headerReference w:type="default" r:id="rId7"/>
+      <w:headerReference w:type="default" r:id="rId8"/>
       <w:pgSz w:w="11906" w:h="16838"/>
       <w:pgMar w:top="1701" w:right="1440" w:bottom="1440" w:left="1440" w:header="851" w:footer="992" w:gutter="0"/>
       <w:cols w:space="720"/>
@@ -1054,23 +1530,13 @@
         <w:bCs/>
       </w:rPr>
     </w:pPr>
-    <w:proofErr w:type="spellStart"/>
     <w:r>
       <w:rPr>
         <w:rFonts w:hint="eastAsia"/>
         <w:b/>
         <w:bCs/>
       </w:rPr>
-      <w:t>팀명</w:t>
-    </w:r>
-    <w:proofErr w:type="spellEnd"/>
-    <w:r>
-      <w:rPr>
-        <w:rFonts w:hint="eastAsia"/>
-        <w:b/>
-        <w:bCs/>
-      </w:rPr>
-      <w:t>:</w:t>
+      <w:t>팀명:</w:t>
     </w:r>
     <w:r>
       <w:rPr>
@@ -1093,6 +1559,95 @@
 <file path=word/numbering.xml><?xml version="1.0" encoding="utf-8"?>
 <w:numbering xmlns:wpc="http://schemas.microsoft.com/office/word/2010/wordprocessingCanvas" xmlns:cx="http://schemas.microsoft.com/office/drawing/2014/chartex" xmlns:cx1="http://schemas.microsoft.com/office/drawing/2015/9/8/chartex" xmlns:cx2="http://schemas.microsoft.com/office/drawing/2015/10/21/chartex" xmlns:cx3="http://schemas.microsoft.com/office/drawing/2016/5/9/chartex" xmlns:cx4="http://schemas.microsoft.com/office/drawing/2016/5/10/chartex" xmlns:cx5="http://schemas.microsoft.com/office/drawing/2016/5/11/chartex" xmlns:cx6="http://schemas.microsoft.com/office/drawing/2016/5/12/chartex" xmlns:cx7="http://schemas.microsoft.com/office/drawing/2016/5/13/chartex" xmlns:cx8="http://schemas.microsoft.com/office/drawing/2016/5/14/chartex" xmlns:mc="http://schemas.openxmlformats.org/markup-compatibility/2006" xmlns:aink="http://schemas.microsoft.com/office/drawing/2016/ink" xmlns:am3d="http://schemas.microsoft.com/office/drawing/2017/model3d" xmlns:o="urn:schemas-microsoft-com:office:office" xmlns:r="http://schemas.openxmlformats.org/officeDocument/2006/relationships" xmlns:m="http://schemas.openxmlformats.org/officeDocument/2006/math" xmlns:v="urn:schemas-microsoft-com:vml" xmlns:wp14="http://schemas.microsoft.com/office/word/2010/wordprocessingDrawing" xmlns:wp="http://schemas.openxmlformats.org/drawingml/2006/wordprocessingDrawing" xmlns:w10="urn:schemas-microsoft-com:office:word" xmlns:w="http://schemas.openxmlformats.org/wordprocessingml/2006/main" xmlns:w14="http://schemas.microsoft.com/office/word/2010/wordml" xmlns:w15="http://schemas.microsoft.com/office/word/2012/wordml" xmlns:w16cex="http://schemas.microsoft.com/office/word/2018/wordml/cex" xmlns:w16cid="http://schemas.microsoft.com/office/word/2016/wordml/cid" xmlns:w16="http://schemas.microsoft.com/office/word/2018/wordml" xmlns:w16sdtdh="http://schemas.microsoft.com/office/word/2020/wordml/sdtdatahash" xmlns:w16se="http://schemas.microsoft.com/office/word/2015/wordml/symex" xmlns:wpg="http://schemas.microsoft.com/office/word/2010/wordprocessingGroup" xmlns:wpi="http://schemas.microsoft.com/office/word/2010/wordprocessingInk" xmlns:wne="http://schemas.microsoft.com/office/word/2006/wordml" xmlns:wps="http://schemas.microsoft.com/office/word/2010/wordprocessingShape" mc:Ignorable="w14 w15 w16se w16cid w16 w16cex w16sdtdh wp14">
   <w:abstractNum w:abstractNumId="0" w15:restartNumberingAfterBreak="0">
+    <w:nsid w:val="15A457A3"/>
+    <w:multiLevelType w:val="hybridMultilevel"/>
+    <w:tmpl w:val="4BDCBB40"/>
+    <w:lvl w:ilvl="0" w:tplc="121C0CA4">
+      <w:start w:val="1"/>
+      <w:numFmt w:val="decimal"/>
+      <w:lvlText w:val="%1."/>
+      <w:lvlJc w:val="left"/>
+      <w:pPr>
+        <w:ind w:left="760" w:hanging="360"/>
+      </w:pPr>
+      <w:rPr>
+        <w:rFonts w:hint="default"/>
+      </w:rPr>
+    </w:lvl>
+    <w:lvl w:ilvl="1" w:tplc="04090019" w:tentative="1">
+      <w:start w:val="1"/>
+      <w:numFmt w:val="upperLetter"/>
+      <w:lvlText w:val="%2."/>
+      <w:lvlJc w:val="left"/>
+      <w:pPr>
+        <w:ind w:left="1200" w:hanging="400"/>
+      </w:pPr>
+    </w:lvl>
+    <w:lvl w:ilvl="2" w:tplc="0409001B" w:tentative="1">
+      <w:start w:val="1"/>
+      <w:numFmt w:val="lowerRoman"/>
+      <w:lvlText w:val="%3."/>
+      <w:lvlJc w:val="right"/>
+      <w:pPr>
+        <w:ind w:left="1600" w:hanging="400"/>
+      </w:pPr>
+    </w:lvl>
+    <w:lvl w:ilvl="3" w:tplc="0409000F" w:tentative="1">
+      <w:start w:val="1"/>
+      <w:numFmt w:val="decimal"/>
+      <w:lvlText w:val="%4."/>
+      <w:lvlJc w:val="left"/>
+      <w:pPr>
+        <w:ind w:left="2000" w:hanging="400"/>
+      </w:pPr>
+    </w:lvl>
+    <w:lvl w:ilvl="4" w:tplc="04090019" w:tentative="1">
+      <w:start w:val="1"/>
+      <w:numFmt w:val="upperLetter"/>
+      <w:lvlText w:val="%5."/>
+      <w:lvlJc w:val="left"/>
+      <w:pPr>
+        <w:ind w:left="2400" w:hanging="400"/>
+      </w:pPr>
+    </w:lvl>
+    <w:lvl w:ilvl="5" w:tplc="0409001B" w:tentative="1">
+      <w:start w:val="1"/>
+      <w:numFmt w:val="lowerRoman"/>
+      <w:lvlText w:val="%6."/>
+      <w:lvlJc w:val="right"/>
+      <w:pPr>
+        <w:ind w:left="2800" w:hanging="400"/>
+      </w:pPr>
+    </w:lvl>
+    <w:lvl w:ilvl="6" w:tplc="0409000F" w:tentative="1">
+      <w:start w:val="1"/>
+      <w:numFmt w:val="decimal"/>
+      <w:lvlText w:val="%7."/>
+      <w:lvlJc w:val="left"/>
+      <w:pPr>
+        <w:ind w:left="3200" w:hanging="400"/>
+      </w:pPr>
+    </w:lvl>
+    <w:lvl w:ilvl="7" w:tplc="04090019" w:tentative="1">
+      <w:start w:val="1"/>
+      <w:numFmt w:val="upperLetter"/>
+      <w:lvlText w:val="%8."/>
+      <w:lvlJc w:val="left"/>
+      <w:pPr>
+        <w:ind w:left="3600" w:hanging="400"/>
+      </w:pPr>
+    </w:lvl>
+    <w:lvl w:ilvl="8" w:tplc="0409001B" w:tentative="1">
+      <w:start w:val="1"/>
+      <w:numFmt w:val="lowerRoman"/>
+      <w:lvlText w:val="%9."/>
+      <w:lvlJc w:val="right"/>
+      <w:pPr>
+        <w:ind w:left="4000" w:hanging="400"/>
+      </w:pPr>
+    </w:lvl>
+  </w:abstractNum>
+  <w:abstractNum w:abstractNumId="1" w15:restartNumberingAfterBreak="0">
     <w:nsid w:val="40F07EE4"/>
     <w:multiLevelType w:val="hybridMultilevel"/>
     <w:tmpl w:val="F32095FA"/>
@@ -1205,7 +1760,7 @@
       </w:rPr>
     </w:lvl>
   </w:abstractNum>
-  <w:abstractNum w:abstractNumId="1" w15:restartNumberingAfterBreak="0">
+  <w:abstractNum w:abstractNumId="2" w15:restartNumberingAfterBreak="0">
     <w:nsid w:val="427F3D4E"/>
     <w:multiLevelType w:val="hybridMultilevel"/>
     <w:tmpl w:val="DD0A7230"/>
@@ -1294,7 +1849,7 @@
       </w:pPr>
     </w:lvl>
   </w:abstractNum>
-  <w:abstractNum w:abstractNumId="2" w15:restartNumberingAfterBreak="0">
+  <w:abstractNum w:abstractNumId="3" w15:restartNumberingAfterBreak="0">
     <w:nsid w:val="505E7521"/>
     <w:multiLevelType w:val="hybridMultilevel"/>
     <w:tmpl w:val="5ACEEE22"/>
@@ -1383,7 +1938,7 @@
       </w:pPr>
     </w:lvl>
   </w:abstractNum>
-  <w:abstractNum w:abstractNumId="3" w15:restartNumberingAfterBreak="0">
+  <w:abstractNum w:abstractNumId="4" w15:restartNumberingAfterBreak="0">
     <w:nsid w:val="5527761F"/>
     <w:multiLevelType w:val="hybridMultilevel"/>
     <w:tmpl w:val="6A468C20"/>
@@ -1496,7 +2051,7 @@
       </w:rPr>
     </w:lvl>
   </w:abstractNum>
-  <w:abstractNum w:abstractNumId="4" w15:restartNumberingAfterBreak="0">
+  <w:abstractNum w:abstractNumId="5" w15:restartNumberingAfterBreak="0">
     <w:nsid w:val="55C415BB"/>
     <w:multiLevelType w:val="hybridMultilevel"/>
     <w:tmpl w:val="0A9ED440"/>
@@ -1609,7 +2164,7 @@
       </w:rPr>
     </w:lvl>
   </w:abstractNum>
-  <w:abstractNum w:abstractNumId="5" w15:restartNumberingAfterBreak="0">
+  <w:abstractNum w:abstractNumId="6" w15:restartNumberingAfterBreak="0">
     <w:nsid w:val="5E662F43"/>
     <w:multiLevelType w:val="hybridMultilevel"/>
     <w:tmpl w:val="09DED202"/>
@@ -1698,7 +2253,7 @@
       </w:pPr>
     </w:lvl>
   </w:abstractNum>
-  <w:abstractNum w:abstractNumId="6" w15:restartNumberingAfterBreak="0">
+  <w:abstractNum w:abstractNumId="7" w15:restartNumberingAfterBreak="0">
     <w:nsid w:val="63D23F62"/>
     <w:multiLevelType w:val="hybridMultilevel"/>
     <w:tmpl w:val="14822A7E"/>
@@ -1811,7 +2366,96 @@
       </w:rPr>
     </w:lvl>
   </w:abstractNum>
-  <w:abstractNum w:abstractNumId="7" w15:restartNumberingAfterBreak="0">
+  <w:abstractNum w:abstractNumId="8" w15:restartNumberingAfterBreak="0">
+    <w:nsid w:val="6AAD3227"/>
+    <w:multiLevelType w:val="hybridMultilevel"/>
+    <w:tmpl w:val="8FD8E7E6"/>
+    <w:lvl w:ilvl="0" w:tplc="A0020CE8">
+      <w:start w:val="1"/>
+      <w:numFmt w:val="decimal"/>
+      <w:lvlText w:val="%1."/>
+      <w:lvlJc w:val="left"/>
+      <w:pPr>
+        <w:ind w:left="760" w:hanging="360"/>
+      </w:pPr>
+      <w:rPr>
+        <w:rFonts w:hint="default"/>
+      </w:rPr>
+    </w:lvl>
+    <w:lvl w:ilvl="1" w:tplc="04090019" w:tentative="1">
+      <w:start w:val="1"/>
+      <w:numFmt w:val="upperLetter"/>
+      <w:lvlText w:val="%2."/>
+      <w:lvlJc w:val="left"/>
+      <w:pPr>
+        <w:ind w:left="1200" w:hanging="400"/>
+      </w:pPr>
+    </w:lvl>
+    <w:lvl w:ilvl="2" w:tplc="0409001B" w:tentative="1">
+      <w:start w:val="1"/>
+      <w:numFmt w:val="lowerRoman"/>
+      <w:lvlText w:val="%3."/>
+      <w:lvlJc w:val="right"/>
+      <w:pPr>
+        <w:ind w:left="1600" w:hanging="400"/>
+      </w:pPr>
+    </w:lvl>
+    <w:lvl w:ilvl="3" w:tplc="0409000F" w:tentative="1">
+      <w:start w:val="1"/>
+      <w:numFmt w:val="decimal"/>
+      <w:lvlText w:val="%4."/>
+      <w:lvlJc w:val="left"/>
+      <w:pPr>
+        <w:ind w:left="2000" w:hanging="400"/>
+      </w:pPr>
+    </w:lvl>
+    <w:lvl w:ilvl="4" w:tplc="04090019" w:tentative="1">
+      <w:start w:val="1"/>
+      <w:numFmt w:val="upperLetter"/>
+      <w:lvlText w:val="%5."/>
+      <w:lvlJc w:val="left"/>
+      <w:pPr>
+        <w:ind w:left="2400" w:hanging="400"/>
+      </w:pPr>
+    </w:lvl>
+    <w:lvl w:ilvl="5" w:tplc="0409001B" w:tentative="1">
+      <w:start w:val="1"/>
+      <w:numFmt w:val="lowerRoman"/>
+      <w:lvlText w:val="%6."/>
+      <w:lvlJc w:val="right"/>
+      <w:pPr>
+        <w:ind w:left="2800" w:hanging="400"/>
+      </w:pPr>
+    </w:lvl>
+    <w:lvl w:ilvl="6" w:tplc="0409000F" w:tentative="1">
+      <w:start w:val="1"/>
+      <w:numFmt w:val="decimal"/>
+      <w:lvlText w:val="%7."/>
+      <w:lvlJc w:val="left"/>
+      <w:pPr>
+        <w:ind w:left="3200" w:hanging="400"/>
+      </w:pPr>
+    </w:lvl>
+    <w:lvl w:ilvl="7" w:tplc="04090019" w:tentative="1">
+      <w:start w:val="1"/>
+      <w:numFmt w:val="upperLetter"/>
+      <w:lvlText w:val="%8."/>
+      <w:lvlJc w:val="left"/>
+      <w:pPr>
+        <w:ind w:left="3600" w:hanging="400"/>
+      </w:pPr>
+    </w:lvl>
+    <w:lvl w:ilvl="8" w:tplc="0409001B" w:tentative="1">
+      <w:start w:val="1"/>
+      <w:numFmt w:val="lowerRoman"/>
+      <w:lvlText w:val="%9."/>
+      <w:lvlJc w:val="right"/>
+      <w:pPr>
+        <w:ind w:left="4000" w:hanging="400"/>
+      </w:pPr>
+    </w:lvl>
+  </w:abstractNum>
+  <w:abstractNum w:abstractNumId="9" w15:restartNumberingAfterBreak="0">
     <w:nsid w:val="7CD24BF1"/>
     <w:multiLevelType w:val="hybridMultilevel"/>
     <w:tmpl w:val="496ACBD4"/>
@@ -1925,28 +2569,34 @@
     </w:lvl>
   </w:abstractNum>
   <w:num w:numId="1">
+    <w:abstractNumId w:val="5"/>
+  </w:num>
+  <w:num w:numId="2">
     <w:abstractNumId w:val="4"/>
   </w:num>
-  <w:num w:numId="2">
+  <w:num w:numId="3">
+    <w:abstractNumId w:val="1"/>
+  </w:num>
+  <w:num w:numId="4">
+    <w:abstractNumId w:val="9"/>
+  </w:num>
+  <w:num w:numId="5">
+    <w:abstractNumId w:val="7"/>
+  </w:num>
+  <w:num w:numId="6">
+    <w:abstractNumId w:val="2"/>
+  </w:num>
+  <w:num w:numId="7">
+    <w:abstractNumId w:val="6"/>
+  </w:num>
+  <w:num w:numId="8">
     <w:abstractNumId w:val="3"/>
   </w:num>
-  <w:num w:numId="3">
+  <w:num w:numId="9">
+    <w:abstractNumId w:val="8"/>
+  </w:num>
+  <w:num w:numId="10">
     <w:abstractNumId w:val="0"/>
-  </w:num>
-  <w:num w:numId="4">
-    <w:abstractNumId w:val="7"/>
-  </w:num>
-  <w:num w:numId="5">
-    <w:abstractNumId w:val="6"/>
-  </w:num>
-  <w:num w:numId="6">
-    <w:abstractNumId w:val="1"/>
-  </w:num>
-  <w:num w:numId="7">
-    <w:abstractNumId w:val="5"/>
-  </w:num>
-  <w:num w:numId="8">
-    <w:abstractNumId w:val="2"/>
   </w:num>
 </w:numbering>
 </file>

</xml_diff>